<commit_message>
Implementacion de Chata acoplada, fisicas y pruebas unitarias
</commit_message>
<xml_diff>
--- a/CiudadConduccion/Documento-ciudad.docx
+++ b/CiudadConduccion/Documento-ciudad.docx
@@ -202,13 +202,7 @@
         <w:rPr>
           <w:lang w:val="es-MX"/>
         </w:rPr>
-        <w:t>). El jugador conduce un auto por una ciudad de 11 × 11 celdas y debe entregar 5 paquetes, frenando sobre cada marca dorada. La ciudad tien</w:t>
-      </w:r>
-      <w:r>
-        <w:rPr>
-          <w:lang w:val="es-MX"/>
-        </w:rPr>
-        <w:t xml:space="preserve">e tráfico autónomo, un peatón, semáforos coordinados, iluminación de día y de noche, un </w:t>
+        <w:t xml:space="preserve">). El jugador conduce un auto por una ciudad de 11 × 11 celdas y debe entregar 5 paquetes, frenando sobre cada marca dorada. La ciudad tiene tráfico autónomo, un peatón, semáforos coordinados, iluminación de día y de noche, un </w:t>
       </w:r>
       <w:proofErr w:type="spellStart"/>
       <w:r>
@@ -250,13 +244,7 @@
         <w:rPr>
           <w:lang w:val="es-MX"/>
         </w:rPr>
-        <w:t>; no se usan imág</w:t>
-      </w:r>
-      <w:r>
-        <w:rPr>
-          <w:lang w:val="es-MX"/>
-        </w:rPr>
-        <w:t>enes, texturas ni modelos externos.</w:t>
+        <w:t>; no se usan imágenes, texturas ni modelos externos.</w:t>
       </w:r>
     </w:p>
     <w:p>
@@ -315,11 +303,16 @@
         <w:rPr>
           <w:lang w:val="es-MX"/>
         </w:rPr>
-        <w:t xml:space="preserve"> de </w:t>
-      </w:r>
-      <w:r>
-        <w:rPr>
-          <w:b/>
+        <w:t xml:space="preserve"> </w:t>
+      </w:r>
+      <w:r>
+        <w:rPr>
+          <w:lang w:val="es-MX"/>
+        </w:rPr>
+        <w:t xml:space="preserve">de </w:t>
+      </w:r>
+      <w:r>
+        <w:rPr>
           <w:bCs/>
           <w:lang w:val="es-MX"/>
         </w:rPr>
@@ -336,7 +329,6 @@
       </w:r>
       <w:r>
         <w:rPr>
-          <w:b/>
           <w:bCs/>
         </w:rPr>
         <w:t xml:space="preserve">19 </w:t>
@@ -344,7 +336,6 @@
       <w:proofErr w:type="spellStart"/>
       <w:r>
         <w:rPr>
-          <w:b/>
           <w:bCs/>
         </w:rPr>
         <w:t>manzanas</w:t>
@@ -352,7 +343,6 @@
       <w:proofErr w:type="spellEnd"/>
       <w:r>
         <w:rPr>
-          <w:b/>
           <w:bCs/>
         </w:rPr>
         <w:t xml:space="preserve"> con </w:t>
@@ -360,7 +350,6 @@
       <w:proofErr w:type="spellStart"/>
       <w:r>
         <w:rPr>
-          <w:b/>
           <w:bCs/>
         </w:rPr>
         <w:t>edificio</w:t>
@@ -368,7 +357,6 @@
       <w:proofErr w:type="spellEnd"/>
       <w:r>
         <w:rPr>
-          <w:b/>
           <w:bCs/>
         </w:rPr>
         <w:t xml:space="preserve"> y 6 </w:t>
@@ -376,7 +364,6 @@
       <w:proofErr w:type="spellStart"/>
       <w:r>
         <w:rPr>
-          <w:b/>
           <w:bCs/>
         </w:rPr>
         <w:t>parques</w:t>
@@ -402,13 +389,7 @@
         <w:rPr>
           <w:lang w:val="es-MX"/>
         </w:rPr>
-        <w:t>Las filas y column</w:t>
-      </w:r>
-      <w:r>
-        <w:rPr>
-          <w:lang w:val="es-MX"/>
-        </w:rPr>
-        <w:t>as pares son calles, de modo que la ciudad forma una cuadrícula regular de avenidas.</w:t>
+        <w:t>Las filas y columnas pares son calles, de modo que la ciudad forma una cuadrícula regular de avenidas.</w:t>
       </w:r>
     </w:p>
     <w:p>
@@ -476,13 +457,7 @@
         <w:rPr>
           <w:lang w:val="es-MX"/>
         </w:rPr>
-        <w:t xml:space="preserve"> y la perspectiva (400 unida</w:t>
-      </w:r>
-      <w:r>
-        <w:rPr>
-          <w:lang w:val="es-MX"/>
-        </w:rPr>
-        <w:t>des) se adaptan solos al tamaño.</w:t>
+        <w:t xml:space="preserve"> y la perspectiva (400 unidades) se adaptan solos al tamaño.</w:t>
       </w:r>
     </w:p>
     <w:p>
@@ -544,13 +519,7 @@
         <w:rPr>
           <w:lang w:val="es-MX"/>
         </w:rPr>
-        <w:t>Las 3 × 3 manzanas centrales corresponden a la c</w:t>
-      </w:r>
-      <w:r>
-        <w:rPr>
-          <w:lang w:val="es-MX"/>
-        </w:rPr>
-        <w:t xml:space="preserve">iudad original; el anillo exterior forma cuatro sectores nuevos. Cada sector tiene un color, un letrero 3D en la ciudad, su nombre en el </w:t>
+        <w:t xml:space="preserve">Las 3 × 3 manzanas centrales corresponden a la ciudad original; el anillo exterior forma cuatro sectores nuevos. Cada sector tiene un color, un letrero 3D en la ciudad, su nombre en el </w:t>
       </w:r>
       <w:proofErr w:type="spellStart"/>
       <w:r>
@@ -1162,13 +1131,7 @@
         <w:rPr>
           <w:lang w:val="es-MX"/>
         </w:rPr>
-        <w:t xml:space="preserve"> banco, cine, policía y universidad (con un museo en su fac</w:t>
-      </w:r>
-      <w:r>
-        <w:rPr>
-          <w:lang w:val="es-MX"/>
-        </w:rPr>
-        <w:t>hada este).</w:t>
+        <w:t xml:space="preserve"> banco, cine, policía y universidad (con un museo en su fachada este).</w:t>
       </w:r>
     </w:p>
     <w:p>
@@ -1284,7 +1247,6 @@
       </w:r>
       <w:r>
         <w:rPr>
-          <w:b/>
           <w:bCs/>
           <w:lang w:val="es-MX"/>
         </w:rPr>
@@ -1294,13 +1256,13 @@
         <w:rPr>
           <w:lang w:val="es-MX"/>
         </w:rPr>
-        <w:t>, que dejan más espacio para doblar en los cru</w:t>
-      </w:r>
-      <w:r>
-        <w:rPr>
-          <w:lang w:val="es-MX"/>
-        </w:rPr>
-        <w:t>ces.</w:t>
+        <w:t xml:space="preserve">, </w:t>
+      </w:r>
+      <w:r>
+        <w:rPr>
+          <w:lang w:val="es-MX"/>
+        </w:rPr>
+        <w:t>que dejan más espacio para doblar en los cruces.</w:t>
       </w:r>
     </w:p>
     <w:p>
@@ -1323,7 +1285,6 @@
       </w:r>
       <w:r>
         <w:rPr>
-          <w:b/>
           <w:bCs/>
           <w:lang w:val="es-MX"/>
         </w:rPr>
@@ -1350,7 +1311,6 @@
       </w:pPr>
       <w:r>
         <w:rPr>
-          <w:b/>
           <w:bCs/>
           <w:lang w:val="es-MX"/>
         </w:rPr>
@@ -1392,17 +1352,11 @@
         <w:rPr>
           <w:lang w:val="es-MX"/>
         </w:rPr>
-        <w:t>Cada cruce t</w:t>
-      </w:r>
-      <w:r>
-        <w:rPr>
-          <w:lang w:val="es-MX"/>
-        </w:rPr>
-        <w:t xml:space="preserve">iene una luz para la calle horizontal (fila, este-oeste) y otra para la vertical (columna, norte-sur). Están desfasadas medio ciclo y </w:t>
-      </w:r>
-      <w:r>
-        <w:rPr>
-          <w:b/>
+        <w:t xml:space="preserve">Cada cruce tiene una luz para la calle horizontal (fila, este-oeste) y otra para la vertical (columna, norte-sur). Están desfasadas medio ciclo y </w:t>
+      </w:r>
+      <w:bookmarkStart w:id="0" w:name="_GoBack"/>
+      <w:r>
+        <w:rPr>
           <w:bCs/>
           <w:lang w:val="es-MX"/>
         </w:rPr>
@@ -1415,6 +1369,7 @@
         <w:t>.</w:t>
       </w:r>
     </w:p>
+    <w:bookmarkEnd w:id="0"/>
     <w:p>
       <w:pPr>
         <w:pStyle w:val="Prrafodelista"/>
@@ -1431,13 +1386,7 @@
         <w:rPr>
           <w:lang w:val="es-MX"/>
         </w:rPr>
-        <w:t>Ciclo de 14 s: 7.5 s en rojo, 4.5 s en verde y 2 s en amarillo, con medio segundo en que ambas</w:t>
-      </w:r>
-      <w:r>
-        <w:rPr>
-          <w:lang w:val="es-MX"/>
-        </w:rPr>
-        <w:t xml:space="preserve"> calles quedan en rojo para vaciar el cruce.</w:t>
+        <w:t>Ciclo de 14 s: 7.5 s en rojo, 4.5 s en verde y 2 s en amarillo, con medio segundo en que ambas calles quedan en rojo para vaciar el cruce.</w:t>
       </w:r>
     </w:p>
     <w:p>
@@ -1475,13 +1424,7 @@
         <w:rPr>
           <w:lang w:val="es-MX"/>
         </w:rPr>
-        <w:t>Los 9 cruces del centro est</w:t>
-      </w:r>
-      <w:r>
-        <w:rPr>
-          <w:lang w:val="es-MX"/>
-        </w:rPr>
-        <w:t>án sincronizados; los de los sectores nuevos se intercalan con un desfase distinto.</w:t>
+        <w:t>Los 9 cruces del centro están sincronizados; los de los sectores nuevos se intercalan con un desfase distinto.</w:t>
       </w:r>
     </w:p>
     <w:p>
@@ -2530,13 +2473,7 @@
         <w:rPr>
           <w:lang w:val="es-MX"/>
         </w:rPr>
-        <w:t xml:space="preserve">Mapa de 11 × </w:t>
-      </w:r>
-      <w:r>
-        <w:rPr>
-          <w:lang w:val="es-MX"/>
-        </w:rPr>
-        <w:t>11 con sectores nuevos y límites calculados desde la matriz.</w:t>
+        <w:t>Mapa de 11 × 11 con sectores nuevos y límites calculados desde la matriz.</w:t>
       </w:r>
     </w:p>
     <w:p>
@@ -2568,13 +2505,7 @@
         <w:rPr>
           <w:lang w:val="es-MX"/>
         </w:rPr>
-        <w:t xml:space="preserve"> (ruedas incluidas) contra las aceras ochavadas, usando el teorema del eje separador. Si roza la acera de refilón se desliza a lo largo de ella en vez de frena</w:t>
-      </w:r>
-      <w:r>
-        <w:rPr>
-          <w:lang w:val="es-MX"/>
-        </w:rPr>
-        <w:t>r en seco.</w:t>
+        <w:t xml:space="preserve"> (ruedas incluidas) contra las aceras ochavadas, usando el teorema del eje separador. Si roza la acera de refilón se desliza a lo largo de ella en vez de frenar en seco.</w:t>
       </w:r>
     </w:p>
     <w:p>
@@ -2661,16 +2592,8 @@
         <w:rPr>
           <w:lang w:val="es-MX"/>
         </w:rPr>
-        <w:t>),</w:t>
-      </w:r>
-      <w:r>
-        <w:rPr>
-          <w:lang w:val="es-MX"/>
-        </w:rPr>
-        <w:t xml:space="preserve"> base de las paredes algo más oscura y bruma lejana del color del cielo.</w:t>
-      </w:r>
-      <w:bookmarkStart w:id="0" w:name="_GoBack"/>
-      <w:bookmarkEnd w:id="0"/>
+        <w:t>), base de las paredes algo más oscura y bruma lejana del color del cielo.</w:t>
+      </w:r>
     </w:p>
     <w:p>
       <w:pPr>
@@ -2731,10 +2654,7 @@
         <w:pStyle w:val="Ttulo2"/>
       </w:pPr>
       <w:r>
-        <w:t>4.3</w:t>
-      </w:r>
-      <w:r>
-        <w:t xml:space="preserve"> </w:t>
+        <w:t xml:space="preserve">4.3 </w:t>
       </w:r>
       <w:proofErr w:type="spellStart"/>
       <w:r>
@@ -2843,13 +2763,7 @@
         <w:rPr>
           <w:lang w:val="es-MX"/>
         </w:rPr>
-        <w:t>Vista superior or</w:t>
-      </w:r>
-      <w:r>
-        <w:rPr>
-          <w:lang w:val="es-MX"/>
-        </w:rPr>
-        <w:t xml:space="preserve">tográfica en la esquina, dibujada en un segundo pase con </w:t>
+        <w:t xml:space="preserve">Vista superior ortográfica en la esquina, dibujada en un segundo pase con </w:t>
       </w:r>
       <w:proofErr w:type="spellStart"/>
       <w:r>
@@ -2943,13 +2857,7 @@
         <w:rPr>
           <w:lang w:val="es-MX"/>
         </w:rPr>
-        <w:t xml:space="preserve"> par</w:t>
-      </w:r>
-      <w:r>
-        <w:rPr>
-          <w:lang w:val="es-MX"/>
-        </w:rPr>
-        <w:t>a el norte.</w:t>
+        <w:t xml:space="preserve"> para el norte.</w:t>
       </w:r>
     </w:p>
     <w:p>
@@ -3027,13 +2935,7 @@
         <w:rPr>
           <w:lang w:val="es-MX"/>
         </w:rPr>
-        <w:t xml:space="preserve"> que rodea las manzanas por la acera y cruza s</w:t>
-      </w:r>
-      <w:r>
-        <w:rPr>
-          <w:lang w:val="es-MX"/>
-        </w:rPr>
-        <w:t>olo al comenzar el rojo de la calle que atraviesa; se detiene si un auto le cierra el paso.</w:t>
+        <w:t xml:space="preserve"> que rodea las manzanas por la acera y cruza solo al comenzar el rojo de la calle que atraviesa; se detiene si un auto le cierra el paso.</w:t>
       </w:r>
     </w:p>
     <w:p>
@@ -3101,13 +3003,7 @@
         <w:rPr>
           <w:lang w:val="es-MX"/>
         </w:rPr>
-        <w:t xml:space="preserve"> con cabina, volante, brazos cuadrados y mirad</w:t>
-      </w:r>
-      <w:r>
-        <w:rPr>
-          <w:lang w:val="es-MX"/>
-        </w:rPr>
-        <w:t>a con el ratón.</w:t>
+        <w:t xml:space="preserve"> con cabina, volante, brazos cuadrados y mirada con el ratón.</w:t>
       </w:r>
     </w:p>
     <w:p>
@@ -3173,13 +3069,7 @@
         <w:rPr>
           <w:lang w:val="es-MX"/>
         </w:rPr>
-        <w:t xml:space="preserve"> contiene 18 prue</w:t>
-      </w:r>
-      <w:r>
-        <w:rPr>
-          <w:lang w:val="es-MX"/>
-        </w:rPr>
-        <w:t xml:space="preserve">bas </w:t>
+        <w:t xml:space="preserve"> contiene 18 pruebas </w:t>
       </w:r>
       <w:proofErr w:type="spellStart"/>
       <w:r>
@@ -3193,13 +3083,7 @@
         <w:rPr>
           <w:lang w:val="es-MX"/>
         </w:rPr>
-        <w:t xml:space="preserve"> que se ejecutan sin abrir ventana: tamaño del mapa, límites y colisiones, que todas las entregas se puedan alcanzar por calles, farolas, reinicio, tráfico durante 4 minutos simulados, semáforos (incluido que fila y columna nunca tengan paso a la </w:t>
-      </w:r>
-      <w:r>
-        <w:rPr>
-          <w:lang w:val="es-MX"/>
-        </w:rPr>
-        <w:t>vez), peatón y negocios según la altura.</w:t>
+        <w:t xml:space="preserve"> que se ejecutan sin abrir ventana: tamaño del mapa, límites y colisiones, que todas las entregas se puedan alcanzar por calles, farolas, reinicio, tráfico durante 4 minutos simulados, semáforos (incluido que fila y columna nunca tengan paso a la vez), peatón y negocios según la altura.</w:t>
       </w:r>
     </w:p>
     <w:p>
@@ -4100,13 +3984,7 @@
         <w:rPr>
           <w:lang w:val="es-MX"/>
         </w:rPr>
-        <w:t>Conexión a internet la pri</w:t>
-      </w:r>
-      <w:r>
-        <w:rPr>
-          <w:lang w:val="es-MX"/>
-        </w:rPr>
-        <w:t xml:space="preserve">mera vez, para que </w:t>
+        <w:t xml:space="preserve">Conexión a internet la primera vez, para que </w:t>
       </w:r>
       <w:proofErr w:type="spellStart"/>
       <w:r>
@@ -4279,15 +4157,7 @@
           <w:sz w:val="20"/>
           <w:szCs w:val="20"/>
         </w:rPr>
-        <w:t xml:space="preserve"> compi</w:t>
-      </w:r>
-      <w:r>
-        <w:rPr>
-          <w:rFonts w:ascii="Consolas" w:eastAsia="Consolas" w:hAnsi="Consolas" w:cs="Consolas"/>
-          <w:sz w:val="20"/>
-          <w:szCs w:val="20"/>
-        </w:rPr>
-        <w:t xml:space="preserve">le </w:t>
+        <w:t xml:space="preserve"> compile </w:t>
       </w:r>
       <w:proofErr w:type="spellStart"/>
       <w:r>
@@ -4523,16 +4393,7 @@
           <w:szCs w:val="20"/>
           <w:lang w:val="es-MX"/>
         </w:rPr>
-        <w:t>XstartOnFirstTh</w:t>
-      </w:r>
-      <w:r>
-        <w:rPr>
-          <w:rFonts w:ascii="Consolas" w:eastAsia="Consolas" w:hAnsi="Consolas" w:cs="Consolas"/>
-          <w:sz w:val="20"/>
-          <w:szCs w:val="20"/>
-          <w:lang w:val="es-MX"/>
-        </w:rPr>
-        <w:t>read</w:t>
+        <w:t>XstartOnFirstThread</w:t>
       </w:r>
       <w:proofErr w:type="spellEnd"/>
       <w:r>
@@ -5149,13 +5010,7 @@
         <w:rPr>
           <w:lang w:val="es-MX"/>
         </w:rPr>
-        <w:t>Toda l</w:t>
-      </w:r>
-      <w:r>
-        <w:rPr>
-          <w:lang w:val="es-MX"/>
-        </w:rPr>
-        <w:t>a geometría está hecha con cajas; no hay curvas, texturas ni parabrisas transparente.</w:t>
+        <w:t>Toda la geometría está hecha con cajas; no hay curvas, texturas ni parabrisas transparente.</w:t>
       </w:r>
     </w:p>
     <w:p>
@@ -5212,13 +5067,7 @@
         <w:rPr>
           <w:lang w:val="es-MX"/>
         </w:rPr>
-        <w:t>El ju</w:t>
-      </w:r>
-      <w:r>
-        <w:rPr>
-          <w:lang w:val="es-MX"/>
-        </w:rPr>
-        <w:t>gador no recibe penalización por pasar en rojo.</w:t>
+        <w:t>El jugador no recibe penalización por pasar en rojo.</w:t>
       </w:r>
     </w:p>
     <w:p>
@@ -5296,13 +5145,7 @@
         <w:rPr>
           <w:lang w:val="es-MX"/>
         </w:rPr>
-        <w:t>Se necesita un e</w:t>
-      </w:r>
-      <w:r>
-        <w:rPr>
-          <w:lang w:val="es-MX"/>
-        </w:rPr>
-        <w:t xml:space="preserve">ntorno gráfico con </w:t>
+        <w:t xml:space="preserve">Se necesita un entorno gráfico con </w:t>
       </w:r>
       <w:proofErr w:type="spellStart"/>
       <w:r>
@@ -5796,13 +5639,7 @@
           <w:lang w:val="es-MX"/>
         </w:rPr>
         <w:lastRenderedPageBreak/>
-        <w:t>No se usaron imágenes, modelos 3D, fuentes tipográficas ni fragmentos de código de otros proyectos. La fuente de 5 × 7 píxeles, las rutas del tráfico y los modelos de cajas se escribieron para este proyecto. Los algoritmos usados son técnicas estándar de g</w:t>
-      </w:r>
-      <w:r>
-        <w:rPr>
-          <w:lang w:val="es-MX"/>
-        </w:rPr>
-        <w:t xml:space="preserve">ráficos: iluminación de Lambert y </w:t>
+        <w:t xml:space="preserve">No se usaron imágenes, modelos 3D, fuentes tipográficas ni fragmentos de código de otros proyectos. La fuente de 5 × 7 píxeles, las rutas del tráfico y los modelos de cajas se escribieron para este proyecto. Los algoritmos usados son técnicas estándar de gráficos: iluminación de Lambert y </w:t>
       </w:r>
       <w:proofErr w:type="spellStart"/>
       <w:r>
@@ -6246,18 +6083,7 @@
           <w:szCs w:val="20"/>
           <w:lang w:val="es-MX"/>
         </w:rPr>
-        <w:t>Figura 5. Vista aérea de noche: ve</w:t>
-      </w:r>
-      <w:r>
-        <w:rPr>
-          <w:i/>
-          <w:iCs/>
-          <w:color w:val="595959"/>
-          <w:sz w:val="20"/>
-          <w:szCs w:val="20"/>
-          <w:lang w:val="es-MX"/>
-        </w:rPr>
-        <w:t>ntanas encendidas, farolas, semáforos y faros del auto.</w:t>
+        <w:t>Figura 5. Vista aérea de noche: ventanas encendidas, farolas, semáforos y faros del auto.</w:t>
       </w:r>
     </w:p>
     <w:sectPr>
@@ -6363,7 +6189,7 @@
         <w:sz w:val="18"/>
         <w:szCs w:val="18"/>
       </w:rPr>
-      <w:t>9</w:t>
+      <w:t>1</w:t>
     </w:r>
     <w:r>
       <w:rPr>

</xml_diff>